<commit_message>
feat: complete LAB01 SVM pipeline, grid search and unit tests
</commit_message>
<xml_diff>
--- a/Practicas/FJ1656_MañanáSantana_PracticaLab00.docx
+++ b/Practicas/FJ1656_MañanáSantana_PracticaLab00.docx
@@ -124,6 +124,7 @@
             <w:dataBinding w:prefixMappings="xmlns:ns0='http://purl.org/dc/elements/1.1/' xmlns:ns1='http://schemas.openxmlformats.org/package/2006/metadata/core-properties' " w:xpath="/ns1:coreProperties[1]/ns0:title[1]" w:storeItemID="{6C3C8BC8-F283-45AE-878A-BAB7291924A1}"/>
             <w:text/>
           </w:sdtPr>
+          <w:sdtEndPr/>
           <w:sdtContent>
             <w:p>
               <w:pPr>
@@ -150,7 +151,17 @@
                   <w:sz w:val="72"/>
                   <w:szCs w:val="72"/>
                 </w:rPr>
-                <w:t>Lab 00</w:t>
+                <w:t>lab</w:t>
+              </w:r>
+              <w:r>
+                <w:rPr>
+                  <w:rFonts w:ascii="Times New Roman" w:eastAsiaTheme="majorEastAsia" w:hAnsi="Times New Roman" w:cs="Times New Roman"/>
+                  <w:caps/>
+                  <w:color w:val="156082" w:themeColor="accent1"/>
+                  <w:sz w:val="72"/>
+                  <w:szCs w:val="72"/>
+                </w:rPr>
+                <w:t>00</w:t>
               </w:r>
             </w:p>
           </w:sdtContent>
@@ -175,6 +186,7 @@
             <w:dataBinding w:prefixMappings="xmlns:ns0='http://purl.org/dc/elements/1.1/' xmlns:ns1='http://schemas.openxmlformats.org/package/2006/metadata/core-properties' " w:xpath="/ns1:coreProperties[1]/ns0:subject[1]" w:storeItemID="{6C3C8BC8-F283-45AE-878A-BAB7291924A1}"/>
             <w:text/>
           </w:sdtPr>
+          <w:sdtEndPr/>
           <w:sdtContent>
             <w:p>
               <w:pPr>
@@ -312,6 +324,7 @@
                                     <w:calendar w:val="gregorian"/>
                                   </w:date>
                                 </w:sdtPr>
+                                <w:sdtEndPr/>
                                 <w:sdtContent>
                                   <w:p>
                                     <w:pPr>
@@ -360,6 +373,7 @@
                                     <w:dataBinding w:prefixMappings="xmlns:ns0='http://schemas.openxmlformats.org/officeDocument/2006/extended-properties' " w:xpath="/ns0:Properties[1]/ns0:Company[1]" w:storeItemID="{6668398D-A668-4E3E-A5EB-62B293D839F1}"/>
                                     <w:text/>
                                   </w:sdtPr>
+                                  <w:sdtEndPr/>
                                   <w:sdtContent>
                                     <w:r>
                                       <w:rPr>
@@ -676,6 +690,7 @@
       <w:r>
         <w:rPr>
           <w:rFonts w:ascii="Times New Roman" w:hAnsi="Times New Roman" w:cs="Times New Roman"/>
+          <w:noProof/>
           <w:lang w:val="es-DO"/>
         </w:rPr>
         <w:lastRenderedPageBreak/>
@@ -734,6 +749,7 @@
       <w:r>
         <w:rPr>
           <w:rFonts w:ascii="Times New Roman" w:hAnsi="Times New Roman" w:cs="Times New Roman"/>
+          <w:noProof/>
           <w:lang w:val="es-DO"/>
         </w:rPr>
         <w:lastRenderedPageBreak/>
@@ -792,6 +808,7 @@
       <w:r>
         <w:rPr>
           <w:rFonts w:ascii="Times New Roman" w:hAnsi="Times New Roman" w:cs="Times New Roman"/>
+          <w:noProof/>
           <w:lang w:val="es-DO"/>
         </w:rPr>
         <w:lastRenderedPageBreak/>
@@ -850,6 +867,7 @@
       <w:r>
         <w:rPr>
           <w:rFonts w:ascii="Times New Roman" w:hAnsi="Times New Roman" w:cs="Times New Roman"/>
+          <w:noProof/>
           <w:lang w:val="es-DO"/>
         </w:rPr>
         <w:lastRenderedPageBreak/>
@@ -900,6 +918,7 @@
       <w:r>
         <w:rPr>
           <w:rFonts w:ascii="Times New Roman" w:hAnsi="Times New Roman" w:cs="Times New Roman"/>
+          <w:noProof/>
           <w:lang w:val="es-DO"/>
         </w:rPr>
         <w:drawing>
@@ -2635,9 +2654,11 @@
     <w:rsid w:val="000B4A77"/>
     <w:rsid w:val="00122022"/>
     <w:rsid w:val="0017688F"/>
+    <w:rsid w:val="001C3711"/>
     <w:rsid w:val="001D6187"/>
     <w:rsid w:val="001D6B70"/>
     <w:rsid w:val="00204CD8"/>
+    <w:rsid w:val="002071F7"/>
     <w:rsid w:val="002B058C"/>
     <w:rsid w:val="002E5D55"/>
     <w:rsid w:val="002E63FD"/>
@@ -3465,41 +3486,17 @@
 </file>
 
 <file path=customXml/item2.xml><?xml version="1.0" encoding="utf-8"?>
-<?mso-contentType ?>
-<FormTemplates xmlns="http://schemas.microsoft.com/sharepoint/v3/contenttype/forms">
-  <Display>DocumentLibraryForm</Display>
-  <Edit>DocumentLibraryForm</Edit>
-  <New>DocumentLibraryForm</New>
-</FormTemplates>
+<p:properties xmlns:p="http://schemas.microsoft.com/office/2006/metadata/properties" xmlns:xsi="http://www.w3.org/2001/XMLSchema-instance" xmlns:pc="http://schemas.microsoft.com/office/infopath/2007/PartnerControls">
+  <documentManagement>
+    <TaxCatchAll xmlns="6bb79d28-80c9-4192-b874-25d85d9db259" xsi:nil="true"/>
+    <lcf76f155ced4ddcb4097134ff3c332f xmlns="5d10a710-9273-40be-99b8-c91e98a6b38c">
+      <Terms xmlns="http://schemas.microsoft.com/office/infopath/2007/PartnerControls"/>
+    </lcf76f155ced4ddcb4097134ff3c332f>
+  </documentManagement>
+</p:properties>
 </file>
 
 <file path=customXml/item3.xml><?xml version="1.0" encoding="utf-8"?>
-<b:Sources xmlns:b="http://schemas.openxmlformats.org/officeDocument/2006/bibliography" xmlns="http://schemas.openxmlformats.org/officeDocument/2006/bibliography" SelectedStyle="\APASixthEditionOfficeOnline.xsl" StyleName="APA" Version="6">
-  <b:Source>
-    <b:Tag>Gar11</b:Tag>
-    <b:SourceType>DocumentFromInternetSite</b:SourceType>
-    <b:Guid>{34881A65-EA16-4639-9A2D-4E7F37D55DC8}</b:Guid>
-    <b:Year>2011</b:Year>
-    <b:Month>Junio</b:Month>
-    <b:Day>15</b:Day>
-    <b:URL>https://diposit.ub.edu/dspace/bitstream/2445/18402/1/T%C3%A9cnicas%20operantes%202011.pdf</b:URL>
-    <b:Author>
-      <b:Author>
-        <b:NameList>
-          <b:Person>
-            <b:Last>Garcia-Grau</b:Last>
-            <b:First>Arturo</b:First>
-            <b:Middle>Bados y Eugeni</b:Middle>
-          </b:Person>
-        </b:NameList>
-      </b:Author>
-    </b:Author>
-    <b:RefOrder>1</b:RefOrder>
-  </b:Source>
-</b:Sources>
-</file>
-
-<file path=customXml/item4.xml><?xml version="1.0" encoding="utf-8"?>
 <ct:contentTypeSchema xmlns:ct="http://schemas.microsoft.com/office/2006/metadata/contentType" xmlns:ma="http://schemas.microsoft.com/office/2006/metadata/properties/metaAttributes" ct:_="" ma:_="" ma:contentTypeName="Documento" ma:contentTypeID="0x0101007757535DC3339F4CB814A276EF72CA4F" ma:contentTypeVersion="11" ma:contentTypeDescription="Crear nuevo documento." ma:contentTypeScope="" ma:versionID="900f44ead3667f16d47e75ff6a689201">
   <xsd:schema xmlns:xsd="http://www.w3.org/2001/XMLSchema" xmlns:xs="http://www.w3.org/2001/XMLSchema" xmlns:p="http://schemas.microsoft.com/office/2006/metadata/properties" xmlns:ns2="5d10a710-9273-40be-99b8-c91e98a6b38c" xmlns:ns3="6bb79d28-80c9-4192-b874-25d85d9db259" targetNamespace="http://schemas.microsoft.com/office/2006/metadata/properties" ma:root="true" ma:fieldsID="f12143ca8ed7596538601743d77d3d2f" ns2:_="" ns3:_="">
     <xsd:import namespace="5d10a710-9273-40be-99b8-c91e98a6b38c"/>
@@ -3694,15 +3691,39 @@
 </ct:contentTypeSchema>
 </file>
 
+<file path=customXml/item4.xml><?xml version="1.0" encoding="utf-8"?>
+<b:Sources xmlns:b="http://schemas.openxmlformats.org/officeDocument/2006/bibliography" xmlns="http://schemas.openxmlformats.org/officeDocument/2006/bibliography" SelectedStyle="\APASixthEditionOfficeOnline.xsl" StyleName="APA" Version="6">
+  <b:Source>
+    <b:Tag>Gar11</b:Tag>
+    <b:SourceType>DocumentFromInternetSite</b:SourceType>
+    <b:Guid>{34881A65-EA16-4639-9A2D-4E7F37D55DC8}</b:Guid>
+    <b:Year>2011</b:Year>
+    <b:Month>Junio</b:Month>
+    <b:Day>15</b:Day>
+    <b:URL>https://diposit.ub.edu/dspace/bitstream/2445/18402/1/T%C3%A9cnicas%20operantes%202011.pdf</b:URL>
+    <b:Author>
+      <b:Author>
+        <b:NameList>
+          <b:Person>
+            <b:Last>Garcia-Grau</b:Last>
+            <b:First>Arturo</b:First>
+            <b:Middle>Bados y Eugeni</b:Middle>
+          </b:Person>
+        </b:NameList>
+      </b:Author>
+    </b:Author>
+    <b:RefOrder>1</b:RefOrder>
+  </b:Source>
+</b:Sources>
+</file>
+
 <file path=customXml/item5.xml><?xml version="1.0" encoding="utf-8"?>
-<p:properties xmlns:p="http://schemas.microsoft.com/office/2006/metadata/properties" xmlns:xsi="http://www.w3.org/2001/XMLSchema-instance" xmlns:pc="http://schemas.microsoft.com/office/infopath/2007/PartnerControls">
-  <documentManagement>
-    <TaxCatchAll xmlns="6bb79d28-80c9-4192-b874-25d85d9db259" xsi:nil="true"/>
-    <lcf76f155ced4ddcb4097134ff3c332f xmlns="5d10a710-9273-40be-99b8-c91e98a6b38c">
-      <Terms xmlns="http://schemas.microsoft.com/office/infopath/2007/PartnerControls"/>
-    </lcf76f155ced4ddcb4097134ff3c332f>
-  </documentManagement>
-</p:properties>
+<?mso-contentType ?>
+<FormTemplates xmlns="http://schemas.microsoft.com/sharepoint/v3/contenttype/forms">
+  <Display>DocumentLibraryForm</Display>
+  <Edit>DocumentLibraryForm</Edit>
+  <New>DocumentLibraryForm</New>
+</FormTemplates>
 </file>
 
 <file path=customXml/itemProps1.xml><?xml version="1.0" encoding="utf-8"?>
@@ -3714,22 +3735,17 @@
 </file>
 
 <file path=customXml/itemProps2.xml><?xml version="1.0" encoding="utf-8"?>
-<ds:datastoreItem xmlns:ds="http://schemas.openxmlformats.org/officeDocument/2006/customXml" ds:itemID="{165A9622-A9B5-4E9F-A269-CD60E39117DC}">
+<ds:datastoreItem xmlns:ds="http://schemas.openxmlformats.org/officeDocument/2006/customXml" ds:itemID="{AB8F5AAA-29E2-4D7C-B8A0-61ECB9B4C4C2}">
   <ds:schemaRefs>
-    <ds:schemaRef ds:uri="http://schemas.microsoft.com/sharepoint/v3/contenttype/forms"/>
+    <ds:schemaRef ds:uri="http://schemas.microsoft.com/office/2006/metadata/properties"/>
+    <ds:schemaRef ds:uri="http://schemas.microsoft.com/office/infopath/2007/PartnerControls"/>
+    <ds:schemaRef ds:uri="6bb79d28-80c9-4192-b874-25d85d9db259"/>
+    <ds:schemaRef ds:uri="5d10a710-9273-40be-99b8-c91e98a6b38c"/>
   </ds:schemaRefs>
 </ds:datastoreItem>
 </file>
 
 <file path=customXml/itemProps3.xml><?xml version="1.0" encoding="utf-8"?>
-<ds:datastoreItem xmlns:ds="http://schemas.openxmlformats.org/officeDocument/2006/customXml" ds:itemID="{FDA3A5A7-2A64-4348-81DC-C2276460CCE6}">
-  <ds:schemaRefs>
-    <ds:schemaRef ds:uri="http://schemas.openxmlformats.org/officeDocument/2006/bibliography"/>
-  </ds:schemaRefs>
-</ds:datastoreItem>
-</file>
-
-<file path=customXml/itemProps4.xml><?xml version="1.0" encoding="utf-8"?>
 <ds:datastoreItem xmlns:ds="http://schemas.openxmlformats.org/officeDocument/2006/customXml" ds:itemID="{1657B930-47F4-45CA-BC5E-86BBAB207F23}">
   <ds:schemaRefs>
     <ds:schemaRef ds:uri="http://schemas.microsoft.com/office/2006/metadata/contentType"/>
@@ -3748,13 +3764,18 @@
 </ds:datastoreItem>
 </file>
 
+<file path=customXml/itemProps4.xml><?xml version="1.0" encoding="utf-8"?>
+<ds:datastoreItem xmlns:ds="http://schemas.openxmlformats.org/officeDocument/2006/customXml" ds:itemID="{FDA3A5A7-2A64-4348-81DC-C2276460CCE6}">
+  <ds:schemaRefs>
+    <ds:schemaRef ds:uri="http://schemas.openxmlformats.org/officeDocument/2006/bibliography"/>
+  </ds:schemaRefs>
+</ds:datastoreItem>
+</file>
+
 <file path=customXml/itemProps5.xml><?xml version="1.0" encoding="utf-8"?>
-<ds:datastoreItem xmlns:ds="http://schemas.openxmlformats.org/officeDocument/2006/customXml" ds:itemID="{AB8F5AAA-29E2-4D7C-B8A0-61ECB9B4C4C2}">
+<ds:datastoreItem xmlns:ds="http://schemas.openxmlformats.org/officeDocument/2006/customXml" ds:itemID="{165A9622-A9B5-4E9F-A269-CD60E39117DC}">
   <ds:schemaRefs>
-    <ds:schemaRef ds:uri="http://schemas.microsoft.com/office/2006/metadata/properties"/>
-    <ds:schemaRef ds:uri="http://schemas.microsoft.com/office/infopath/2007/PartnerControls"/>
-    <ds:schemaRef ds:uri="6bb79d28-80c9-4192-b874-25d85d9db259"/>
-    <ds:schemaRef ds:uri="5d10a710-9273-40be-99b8-c91e98a6b38c"/>
+    <ds:schemaRef ds:uri="http://schemas.microsoft.com/sharepoint/v3/contenttype/forms"/>
   </ds:schemaRefs>
 </ds:datastoreItem>
 </file>
</xml_diff>